<commit_message>
fix: treatment records denied history checkbox
</commit_message>
<xml_diff>
--- a/backend/src/main/resources/templates/client_intake_form.docx
+++ b/backend/src/main/resources/templates/client_intake_form.docx
@@ -3986,7 +3986,6 @@
               <w:t>fam_deny</w:t>
             </w:r>
             <w:proofErr w:type="spellEnd"/>
-            <w:proofErr w:type="gramStart"/>
             <w:r>
               <w:rPr>
                 <w:rFonts w:ascii="Segoe UI Symbol" w:eastAsia="Segoe UI Symbol" w:hAnsi="Segoe UI Symbol" w:cs="Segoe UI Symbol"/>
@@ -4006,7 +4005,6 @@
               </w:rPr>
               <w:t>ครอบครัวปฏิเสธโรคทางพันธุกรรม</w:t>
             </w:r>
-            <w:proofErr w:type="gramEnd"/>
           </w:p>
         </w:tc>
         <w:tc>
@@ -4043,7 +4041,6 @@
               <w:t>fam_have</w:t>
             </w:r>
             <w:proofErr w:type="spellEnd"/>
-            <w:proofErr w:type="gramStart"/>
             <w:r>
               <w:rPr>
                 <w:rFonts w:ascii="Segoe UI Symbol" w:eastAsia="Segoe UI Symbol" w:hAnsi="Segoe UI Symbol" w:cs="Segoe UI Symbol"/>
@@ -4063,7 +4060,6 @@
               </w:rPr>
               <w:t>ครอบครัวมีโรคทางพันธุกรรม</w:t>
             </w:r>
-            <w:proofErr w:type="gramEnd"/>
           </w:p>
         </w:tc>
       </w:tr>
@@ -4591,7 +4587,6 @@
         <w:t xml:space="preserve"> / </w:t>
       </w:r>
       <w:proofErr w:type="spellStart"/>
-      <w:proofErr w:type="gramStart"/>
       <w:r>
         <w:rPr>
           <w:rFonts w:ascii="AngsanaUPC" w:hAnsi="AngsanaUPC" w:cs="AngsanaUPC"/>
@@ -4609,17 +4604,7 @@
           <w:bCs/>
           <w:sz w:val="28"/>
         </w:rPr>
-        <w:t>(</w:t>
-      </w:r>
-      <w:proofErr w:type="gramEnd"/>
-      <w:r>
-        <w:rPr>
-          <w:rFonts w:ascii="AngsanaUPC" w:hAnsi="AngsanaUPC" w:cs="AngsanaUPC"/>
-          <w:b/>
-          <w:bCs/>
-          <w:sz w:val="28"/>
-        </w:rPr>
-        <w:t>Beats/min)</w:t>
+        <w:t>(Beats/min)</w:t>
       </w:r>
     </w:p>
     <w:p>
@@ -4772,7 +4757,6 @@
         <w:t xml:space="preserve"> </w:t>
       </w:r>
       <w:proofErr w:type="spellStart"/>
-      <w:proofErr w:type="gramStart"/>
       <w:r>
         <w:rPr>
           <w:rFonts w:ascii="AngsanaUPC" w:hAnsi="AngsanaUPC" w:cs="AngsanaUPC"/>
@@ -4783,7 +4767,6 @@
         <w:t>มม.ปรอท</w:t>
       </w:r>
       <w:proofErr w:type="spellEnd"/>
-      <w:proofErr w:type="gramEnd"/>
       <w:r>
         <w:rPr>
           <w:rFonts w:ascii="AngsanaUPC" w:hAnsi="AngsanaUPC" w:cs="AngsanaUPC"/>
@@ -5337,16 +5320,7 @@
           <w:sz w:val="32"/>
           <w:szCs w:val="32"/>
         </w:rPr>
-        <w:t xml:space="preserve">Bicep Jerk   </w:t>
-      </w:r>
-      <w:proofErr w:type="gramStart"/>
-      <w:r>
-        <w:rPr>
-          <w:rFonts w:ascii="AngsanaUPC" w:hAnsi="AngsanaUPC" w:cs="AngsanaUPC"/>
-          <w:sz w:val="32"/>
-          <w:szCs w:val="32"/>
-        </w:rPr>
-        <w:t xml:space="preserve">  </w:t>
+        <w:t xml:space="preserve">Bicep Jerk     </w:t>
       </w:r>
       <w:r>
         <w:rPr>
@@ -5363,16 +5337,7 @@
           <w:sz w:val="32"/>
           <w:szCs w:val="32"/>
         </w:rPr>
-        <w:t>{</w:t>
-      </w:r>
-      <w:proofErr w:type="gramEnd"/>
-      <w:r>
-        <w:rPr>
-          <w:rFonts w:ascii="AngsanaUPC" w:hAnsi="AngsanaUPC" w:cs="AngsanaUPC"/>
-          <w:sz w:val="32"/>
-          <w:szCs w:val="32"/>
-        </w:rPr>
-        <w:t>{</w:t>
+        <w:t>{{</w:t>
       </w:r>
       <w:proofErr w:type="spellStart"/>
       <w:r>
@@ -5519,34 +5484,15 @@
           <w:szCs w:val="32"/>
           <w:cs/>
         </w:rPr>
-        <w:t xml:space="preserve"> </w:t>
-      </w:r>
-      <w:proofErr w:type="gramStart"/>
-      <w:r>
-        <w:rPr>
-          <w:rFonts w:ascii="AngsanaUPC" w:hAnsi="AngsanaUPC" w:cs="AngsanaUPC" w:hint="cs"/>
+        <w:t xml:space="preserve">    </w:t>
+      </w:r>
+      <w:r>
+        <w:rPr>
+          <w:rFonts w:ascii="AngsanaUPC" w:hAnsi="AngsanaUPC" w:cs="AngsanaUPC"/>
           <w:sz w:val="32"/>
           <w:szCs w:val="32"/>
-          <w:cs/>
-        </w:rPr>
-        <w:t xml:space="preserve">   </w:t>
-      </w:r>
-      <w:r>
-        <w:rPr>
-          <w:rFonts w:ascii="AngsanaUPC" w:hAnsi="AngsanaUPC" w:cs="AngsanaUPC"/>
-          <w:sz w:val="32"/>
-          <w:szCs w:val="32"/>
-        </w:rPr>
-        <w:t>{</w:t>
-      </w:r>
-      <w:proofErr w:type="gramEnd"/>
-      <w:r>
-        <w:rPr>
-          <w:rFonts w:ascii="AngsanaUPC" w:hAnsi="AngsanaUPC" w:cs="AngsanaUPC"/>
-          <w:sz w:val="32"/>
-          <w:szCs w:val="32"/>
-        </w:rPr>
-        <w:t>{</w:t>
+        </w:rPr>
+        <w:t>{{</w:t>
       </w:r>
       <w:proofErr w:type="spellStart"/>
       <w:r>
@@ -5683,7 +5629,6 @@
         </w:rPr>
         <w:t xml:space="preserve">Knee Jerk     </w:t>
       </w:r>
-      <w:proofErr w:type="gramStart"/>
       <w:r>
         <w:rPr>
           <w:rFonts w:ascii="AngsanaUPC" w:hAnsi="AngsanaUPC" w:cs="AngsanaUPC" w:hint="cs"/>
@@ -5699,16 +5644,7 @@
           <w:sz w:val="32"/>
           <w:szCs w:val="32"/>
         </w:rPr>
-        <w:t>{</w:t>
-      </w:r>
-      <w:proofErr w:type="gramEnd"/>
-      <w:r>
-        <w:rPr>
-          <w:rFonts w:ascii="AngsanaUPC" w:hAnsi="AngsanaUPC" w:cs="AngsanaUPC"/>
-          <w:sz w:val="32"/>
-          <w:szCs w:val="32"/>
-        </w:rPr>
-        <w:t>{</w:t>
+        <w:t>{{</w:t>
       </w:r>
       <w:proofErr w:type="spellStart"/>
       <w:r>
@@ -5829,7 +5765,6 @@
         </w:rPr>
         <w:t xml:space="preserve">Ankle Jerk    </w:t>
       </w:r>
-      <w:proofErr w:type="gramStart"/>
       <w:r>
         <w:rPr>
           <w:rFonts w:ascii="AngsanaUPC" w:hAnsi="AngsanaUPC" w:cs="AngsanaUPC" w:hint="cs"/>
@@ -5845,16 +5780,7 @@
           <w:sz w:val="32"/>
           <w:szCs w:val="32"/>
         </w:rPr>
-        <w:t>{</w:t>
-      </w:r>
-      <w:proofErr w:type="gramEnd"/>
-      <w:r>
-        <w:rPr>
-          <w:rFonts w:ascii="AngsanaUPC" w:hAnsi="AngsanaUPC" w:cs="AngsanaUPC"/>
-          <w:sz w:val="32"/>
-          <w:szCs w:val="32"/>
-        </w:rPr>
-        <w:t>{</w:t>
+        <w:t>{{</w:t>
       </w:r>
       <w:proofErr w:type="spellStart"/>
       <w:r>
@@ -6145,23 +6071,7 @@
           <w:rFonts w:ascii="Segoe UI Symbol" w:eastAsia="Segoe UI Symbol" w:hAnsi="Segoe UI Symbol" w:cs="Segoe UI Symbol"/>
           <w:sz w:val="28"/>
         </w:rPr>
-        <w:t xml:space="preserve"> </w:t>
-      </w:r>
-      <w:proofErr w:type="gramStart"/>
-      <w:r>
-        <w:rPr>
-          <w:rFonts w:ascii="Segoe UI Symbol" w:eastAsia="Segoe UI Symbol" w:hAnsi="Segoe UI Symbol" w:cs="Segoe UI Symbol"/>
-          <w:sz w:val="28"/>
-        </w:rPr>
-        <w:t xml:space="preserve">   {</w:t>
-      </w:r>
-      <w:proofErr w:type="gramEnd"/>
-      <w:r>
-        <w:rPr>
-          <w:rFonts w:ascii="Segoe UI Symbol" w:eastAsia="Segoe UI Symbol" w:hAnsi="Segoe UI Symbol" w:cs="Segoe UI Symbol"/>
-          <w:sz w:val="28"/>
-        </w:rPr>
-        <w:t>{</w:t>
+        <w:t xml:space="preserve">    {{</w:t>
       </w:r>
       <w:proofErr w:type="spellStart"/>
       <w:r>
@@ -6363,23 +6273,7 @@
           <w:rFonts w:ascii="Segoe UI Symbol" w:eastAsia="Segoe UI Symbol" w:hAnsi="Segoe UI Symbol" w:cs="Segoe UI Symbol"/>
           <w:sz w:val="28"/>
         </w:rPr>
-        <w:t xml:space="preserve"> </w:t>
-      </w:r>
-      <w:proofErr w:type="gramStart"/>
-      <w:r>
-        <w:rPr>
-          <w:rFonts w:ascii="Segoe UI Symbol" w:eastAsia="Segoe UI Symbol" w:hAnsi="Segoe UI Symbol" w:cs="Segoe UI Symbol"/>
-          <w:sz w:val="28"/>
-        </w:rPr>
-        <w:t xml:space="preserve">   {</w:t>
-      </w:r>
-      <w:proofErr w:type="gramEnd"/>
-      <w:r>
-        <w:rPr>
-          <w:rFonts w:ascii="Segoe UI Symbol" w:eastAsia="Segoe UI Symbol" w:hAnsi="Segoe UI Symbol" w:cs="Segoe UI Symbol"/>
-          <w:sz w:val="28"/>
-        </w:rPr>
-        <w:t>{</w:t>
+        <w:t xml:space="preserve">    {{</w:t>
       </w:r>
       <w:proofErr w:type="spellStart"/>
       <w:r>
@@ -6571,23 +6465,7 @@
           <w:rFonts w:ascii="Segoe UI Symbol" w:eastAsia="Segoe UI Symbol" w:hAnsi="Segoe UI Symbol" w:cs="Segoe UI Symbol"/>
           <w:sz w:val="28"/>
         </w:rPr>
-        <w:t xml:space="preserve"> </w:t>
-      </w:r>
-      <w:proofErr w:type="gramStart"/>
-      <w:r>
-        <w:rPr>
-          <w:rFonts w:ascii="Segoe UI Symbol" w:eastAsia="Segoe UI Symbol" w:hAnsi="Segoe UI Symbol" w:cs="Segoe UI Symbol"/>
-          <w:sz w:val="28"/>
-        </w:rPr>
-        <w:t xml:space="preserve">   {</w:t>
-      </w:r>
-      <w:proofErr w:type="gramEnd"/>
-      <w:r>
-        <w:rPr>
-          <w:rFonts w:ascii="Segoe UI Symbol" w:eastAsia="Segoe UI Symbol" w:hAnsi="Segoe UI Symbol" w:cs="Segoe UI Symbol"/>
-          <w:sz w:val="28"/>
-        </w:rPr>
-        <w:t>{</w:t>
+        <w:t xml:space="preserve">    {{</w:t>
       </w:r>
       <w:proofErr w:type="spellStart"/>
       <w:r>
@@ -6741,23 +6619,7 @@
           <w:rFonts w:ascii="Segoe UI Symbol" w:eastAsia="Segoe UI Symbol" w:hAnsi="Segoe UI Symbol" w:cs="Segoe UI Symbol"/>
           <w:sz w:val="28"/>
         </w:rPr>
-        <w:t xml:space="preserve"> </w:t>
-      </w:r>
-      <w:proofErr w:type="gramStart"/>
-      <w:r>
-        <w:rPr>
-          <w:rFonts w:ascii="Segoe UI Symbol" w:eastAsia="Segoe UI Symbol" w:hAnsi="Segoe UI Symbol" w:cs="Segoe UI Symbol"/>
-          <w:sz w:val="28"/>
-        </w:rPr>
-        <w:t xml:space="preserve">   {</w:t>
-      </w:r>
-      <w:proofErr w:type="gramEnd"/>
-      <w:r>
-        <w:rPr>
-          <w:rFonts w:ascii="Segoe UI Symbol" w:eastAsia="Segoe UI Symbol" w:hAnsi="Segoe UI Symbol" w:cs="Segoe UI Symbol"/>
-          <w:sz w:val="28"/>
-        </w:rPr>
-        <w:t>{</w:t>
+        <w:t xml:space="preserve">    {{</w:t>
       </w:r>
       <w:proofErr w:type="spellStart"/>
       <w:r>
@@ -6934,32 +6796,14 @@
           <w:bCs/>
           <w:sz w:val="28"/>
         </w:rPr>
-        <w:t xml:space="preserve"> (Age </w:t>
-      </w:r>
-      <w:proofErr w:type="gramStart"/>
-      <w:r>
-        <w:rPr>
-          <w:rFonts w:ascii="AngsanaUPC" w:eastAsia="Segoe UI Symbol" w:hAnsi="AngsanaUPC" w:cs="AngsanaUPC"/>
-          <w:b/>
-          <w:bCs/>
-          <w:sz w:val="28"/>
-        </w:rPr>
-        <w:t>principles)</w:t>
-      </w:r>
-      <w:r>
-        <w:rPr>
-          <w:rFonts w:ascii="Segoe UI Symbol" w:eastAsia="Segoe UI Symbol" w:hAnsi="Segoe UI Symbol" w:cs="Segoe UI Symbol"/>
-          <w:sz w:val="28"/>
-        </w:rPr>
-        <w:t xml:space="preserve">   </w:t>
-      </w:r>
-      <w:proofErr w:type="gramEnd"/>
-      <w:r>
-        <w:rPr>
-          <w:rFonts w:ascii="Segoe UI Symbol" w:eastAsia="Segoe UI Symbol" w:hAnsi="Segoe UI Symbol" w:cs="Segoe UI Symbol"/>
-          <w:sz w:val="28"/>
-        </w:rPr>
-        <w:t xml:space="preserve"> {{</w:t>
+        <w:t xml:space="preserve"> (Age principles)</w:t>
+      </w:r>
+      <w:r>
+        <w:rPr>
+          <w:rFonts w:ascii="Segoe UI Symbol" w:eastAsia="Segoe UI Symbol" w:hAnsi="Segoe UI Symbol" w:cs="Segoe UI Symbol"/>
+          <w:sz w:val="28"/>
+        </w:rPr>
+        <w:t xml:space="preserve">    {{</w:t>
       </w:r>
       <w:proofErr w:type="spellStart"/>
       <w:r>
@@ -7154,23 +6998,7 @@
           <w:rFonts w:ascii="Segoe UI Symbol" w:eastAsia="Segoe UI Symbol" w:hAnsi="Segoe UI Symbol" w:cs="Segoe UI Symbol"/>
           <w:sz w:val="28"/>
         </w:rPr>
-        <w:t xml:space="preserve"> </w:t>
-      </w:r>
-      <w:proofErr w:type="gramStart"/>
-      <w:r>
-        <w:rPr>
-          <w:rFonts w:ascii="Segoe UI Symbol" w:eastAsia="Segoe UI Symbol" w:hAnsi="Segoe UI Symbol" w:cs="Segoe UI Symbol"/>
-          <w:sz w:val="28"/>
-        </w:rPr>
-        <w:t xml:space="preserve">   {</w:t>
-      </w:r>
-      <w:proofErr w:type="gramEnd"/>
-      <w:r>
-        <w:rPr>
-          <w:rFonts w:ascii="Segoe UI Symbol" w:eastAsia="Segoe UI Symbol" w:hAnsi="Segoe UI Symbol" w:cs="Segoe UI Symbol"/>
-          <w:sz w:val="28"/>
-        </w:rPr>
-        <w:t>{</w:t>
+        <w:t xml:space="preserve">    {{</w:t>
       </w:r>
       <w:proofErr w:type="spellStart"/>
       <w:r>
@@ -7308,31 +7136,77 @@
           <w:rFonts w:ascii="Segoe UI Symbol" w:eastAsia="Segoe UI Symbol" w:hAnsi="Segoe UI Symbol" w:cs="Segoe UI Symbol"/>
           <w:sz w:val="28"/>
         </w:rPr>
+        <w:t xml:space="preserve">    {{</w:t>
+      </w:r>
+      <w:proofErr w:type="spellStart"/>
+      <w:r>
+        <w:rPr>
+          <w:rFonts w:ascii="Segoe UI Symbol" w:eastAsia="Segoe UI Symbol" w:hAnsi="Segoe UI Symbol" w:cs="Segoe UI Symbol"/>
+          <w:sz w:val="28"/>
+        </w:rPr>
+        <w:t>t</w:t>
+      </w:r>
+      <w:r>
+        <w:rPr>
+          <w:rFonts w:ascii="Segoe UI Symbol" w:eastAsia="Segoe UI Symbol" w:hAnsi="Segoe UI Symbol" w:cs="Segoe UI Symbol"/>
+          <w:sz w:val="28"/>
+        </w:rPr>
+        <w:t>c_semha</w:t>
+      </w:r>
+      <w:proofErr w:type="spellEnd"/>
+      <w:r>
+        <w:rPr>
+          <w:rFonts w:ascii="Segoe UI Symbol" w:eastAsia="Segoe UI Symbol" w:hAnsi="Segoe UI Symbol" w:cs="Segoe UI Symbol"/>
+          <w:sz w:val="28"/>
+        </w:rPr>
+        <w:t xml:space="preserve">}} </w:t>
+      </w:r>
+      <w:proofErr w:type="spellStart"/>
+      <w:r>
+        <w:rPr>
+          <w:rFonts w:ascii="AngsanaUPC" w:eastAsia="Segoe UI Symbol" w:hAnsi="AngsanaUPC" w:cs="AngsanaUPC"/>
+          <w:sz w:val="28"/>
+        </w:rPr>
+        <w:t>เสมหะ</w:t>
+      </w:r>
+      <w:proofErr w:type="spellEnd"/>
+      <w:r>
+        <w:rPr>
+          <w:rFonts w:ascii="AngsanaUPC" w:eastAsia="Segoe UI Symbol" w:hAnsi="AngsanaUPC" w:cs="AngsanaUPC"/>
+          <w:sz w:val="28"/>
+        </w:rPr>
         <w:t xml:space="preserve"> </w:t>
       </w:r>
-      <w:proofErr w:type="gramStart"/>
-      <w:r>
-        <w:rPr>
-          <w:rFonts w:ascii="Segoe UI Symbol" w:eastAsia="Segoe UI Symbol" w:hAnsi="Segoe UI Symbol" w:cs="Segoe UI Symbol"/>
-          <w:sz w:val="28"/>
-        </w:rPr>
-        <w:t xml:space="preserve">   {</w:t>
-      </w:r>
-      <w:proofErr w:type="gramEnd"/>
-      <w:r>
-        <w:rPr>
-          <w:rFonts w:ascii="Segoe UI Symbol" w:eastAsia="Segoe UI Symbol" w:hAnsi="Segoe UI Symbol" w:cs="Segoe UI Symbol"/>
-          <w:sz w:val="28"/>
-        </w:rPr>
-        <w:t>{</w:t>
-      </w:r>
-      <w:proofErr w:type="spellStart"/>
-      <w:r>
-        <w:rPr>
-          <w:rFonts w:ascii="Segoe UI Symbol" w:eastAsia="Segoe UI Symbol" w:hAnsi="Segoe UI Symbol" w:cs="Segoe UI Symbol"/>
-          <w:sz w:val="28"/>
-        </w:rPr>
-        <w:t>sc_semha</w:t>
+      <w:proofErr w:type="spellStart"/>
+      <w:r>
+        <w:rPr>
+          <w:rFonts w:ascii="AngsanaUPC" w:eastAsia="Segoe UI Symbol" w:hAnsi="AngsanaUPC" w:cs="AngsanaUPC"/>
+          <w:sz w:val="28"/>
+        </w:rPr>
+        <w:t>Semha</w:t>
+      </w:r>
+      <w:proofErr w:type="spellEnd"/>
+      <w:r>
+        <w:rPr>
+          <w:rFonts w:ascii="Segoe UI Symbol" w:eastAsia="Segoe UI Symbol" w:hAnsi="Segoe UI Symbol" w:cs="Segoe UI Symbol"/>
+          <w:sz w:val="28"/>
+        </w:rPr>
+        <w:t xml:space="preserve">    {{</w:t>
+      </w:r>
+      <w:proofErr w:type="spellStart"/>
+      <w:r>
+        <w:rPr>
+          <w:rFonts w:ascii="Segoe UI Symbol" w:eastAsia="Segoe UI Symbol" w:hAnsi="Segoe UI Symbol" w:cs="Segoe UI Symbol"/>
+          <w:sz w:val="28"/>
+        </w:rPr>
+        <w:t>t</w:t>
+      </w:r>
+      <w:r>
+        <w:rPr>
+          <w:rFonts w:ascii="Segoe UI Symbol" w:eastAsia="Segoe UI Symbol" w:hAnsi="Segoe UI Symbol" w:cs="Segoe UI Symbol"/>
+          <w:sz w:val="28"/>
+        </w:rPr>
+        <w:t>c_vata</w:t>
       </w:r>
       <w:proofErr w:type="spellEnd"/>
       <w:r>
@@ -7348,7 +7222,7 @@
           <w:rFonts w:ascii="AngsanaUPC" w:eastAsia="Segoe UI Symbol" w:hAnsi="AngsanaUPC" w:cs="AngsanaUPC"/>
           <w:sz w:val="28"/>
         </w:rPr>
-        <w:t>เสมหะ</w:t>
+        <w:t>วาตะ</w:t>
       </w:r>
       <w:proofErr w:type="spellEnd"/>
       <w:r>
@@ -7364,7 +7238,7 @@
           <w:rFonts w:ascii="AngsanaUPC" w:eastAsia="Segoe UI Symbol" w:hAnsi="AngsanaUPC" w:cs="AngsanaUPC"/>
           <w:sz w:val="28"/>
         </w:rPr>
-        <w:t>Semha</w:t>
+        <w:t>Vata</w:t>
       </w:r>
       <w:proofErr w:type="spellEnd"/>
       <w:r>
@@ -7380,55 +7254,14 @@
           <w:rFonts w:ascii="Segoe UI Symbol" w:eastAsia="Segoe UI Symbol" w:hAnsi="Segoe UI Symbol" w:cs="Segoe UI Symbol"/>
           <w:sz w:val="28"/>
         </w:rPr>
-        <w:t>sc_vata</w:t>
-      </w:r>
-      <w:proofErr w:type="spellEnd"/>
-      <w:r>
-        <w:rPr>
-          <w:rFonts w:ascii="Segoe UI Symbol" w:eastAsia="Segoe UI Symbol" w:hAnsi="Segoe UI Symbol" w:cs="Segoe UI Symbol"/>
-          <w:sz w:val="28"/>
-        </w:rPr>
-        <w:t xml:space="preserve">}} </w:t>
-      </w:r>
-      <w:proofErr w:type="spellStart"/>
-      <w:r>
-        <w:rPr>
-          <w:rFonts w:ascii="AngsanaUPC" w:eastAsia="Segoe UI Symbol" w:hAnsi="AngsanaUPC" w:cs="AngsanaUPC"/>
-          <w:sz w:val="28"/>
-        </w:rPr>
-        <w:t>วาตะ</w:t>
-      </w:r>
-      <w:proofErr w:type="spellEnd"/>
-      <w:r>
-        <w:rPr>
-          <w:rFonts w:ascii="AngsanaUPC" w:eastAsia="Segoe UI Symbol" w:hAnsi="AngsanaUPC" w:cs="AngsanaUPC"/>
-          <w:sz w:val="28"/>
-        </w:rPr>
-        <w:t xml:space="preserve"> </w:t>
-      </w:r>
-      <w:proofErr w:type="spellStart"/>
-      <w:r>
-        <w:rPr>
-          <w:rFonts w:ascii="AngsanaUPC" w:eastAsia="Segoe UI Symbol" w:hAnsi="AngsanaUPC" w:cs="AngsanaUPC"/>
-          <w:sz w:val="28"/>
-        </w:rPr>
-        <w:t>Vata</w:t>
-      </w:r>
-      <w:proofErr w:type="spellEnd"/>
-      <w:r>
-        <w:rPr>
-          <w:rFonts w:ascii="Segoe UI Symbol" w:eastAsia="Segoe UI Symbol" w:hAnsi="Segoe UI Symbol" w:cs="Segoe UI Symbol"/>
-          <w:sz w:val="28"/>
-        </w:rPr>
-        <w:t xml:space="preserve">    {{</w:t>
-      </w:r>
-      <w:proofErr w:type="spellStart"/>
-      <w:r>
-        <w:rPr>
-          <w:rFonts w:ascii="Segoe UI Symbol" w:eastAsia="Segoe UI Symbol" w:hAnsi="Segoe UI Symbol" w:cs="Segoe UI Symbol"/>
-          <w:sz w:val="28"/>
-        </w:rPr>
-        <w:t>sc_pitta</w:t>
+        <w:t>t</w:t>
+      </w:r>
+      <w:r>
+        <w:rPr>
+          <w:rFonts w:ascii="Segoe UI Symbol" w:eastAsia="Segoe UI Symbol" w:hAnsi="Segoe UI Symbol" w:cs="Segoe UI Symbol"/>
+          <w:sz w:val="28"/>
+        </w:rPr>
+        <w:t>c_pitta</w:t>
       </w:r>
       <w:proofErr w:type="spellEnd"/>
       <w:r>
@@ -7516,30 +7349,14 @@
           <w:rFonts w:ascii="AngsanaUPC" w:eastAsia="Segoe UI Symbol" w:hAnsi="AngsanaUPC" w:cs="AngsanaUPC"/>
           <w:sz w:val="28"/>
         </w:rPr>
-        <w:t xml:space="preserve"> (Place of </w:t>
-      </w:r>
-      <w:proofErr w:type="gramStart"/>
-      <w:r>
-        <w:rPr>
-          <w:rFonts w:ascii="AngsanaUPC" w:eastAsia="Segoe UI Symbol" w:hAnsi="AngsanaUPC" w:cs="AngsanaUPC"/>
-          <w:sz w:val="28"/>
-        </w:rPr>
-        <w:t>birth)</w:t>
-      </w:r>
-      <w:r>
-        <w:rPr>
-          <w:rFonts w:ascii="Segoe UI Symbol" w:eastAsia="Segoe UI Symbol" w:hAnsi="Segoe UI Symbol" w:cs="Segoe UI Symbol"/>
-          <w:sz w:val="28"/>
-        </w:rPr>
-        <w:t xml:space="preserve">   </w:t>
-      </w:r>
-      <w:proofErr w:type="gramEnd"/>
-      <w:r>
-        <w:rPr>
-          <w:rFonts w:ascii="Segoe UI Symbol" w:eastAsia="Segoe UI Symbol" w:hAnsi="Segoe UI Symbol" w:cs="Segoe UI Symbol"/>
-          <w:sz w:val="28"/>
-        </w:rPr>
-        <w:t xml:space="preserve"> {{</w:t>
+        <w:t xml:space="preserve"> (Place of birth)</w:t>
+      </w:r>
+      <w:r>
+        <w:rPr>
+          <w:rFonts w:ascii="Segoe UI Symbol" w:eastAsia="Segoe UI Symbol" w:hAnsi="Segoe UI Symbol" w:cs="Segoe UI Symbol"/>
+          <w:sz w:val="28"/>
+        </w:rPr>
+        <w:t xml:space="preserve">    {{</w:t>
       </w:r>
       <w:proofErr w:type="spellStart"/>
       <w:r>
@@ -7741,30 +7558,14 @@
           <w:rFonts w:ascii="AngsanaUPC" w:eastAsia="Segoe UI Symbol" w:hAnsi="AngsanaUPC" w:cs="AngsanaUPC"/>
           <w:sz w:val="28"/>
         </w:rPr>
-        <w:t xml:space="preserve"> (Present </w:t>
-      </w:r>
-      <w:proofErr w:type="gramStart"/>
-      <w:r>
-        <w:rPr>
-          <w:rFonts w:ascii="AngsanaUPC" w:eastAsia="Segoe UI Symbol" w:hAnsi="AngsanaUPC" w:cs="AngsanaUPC"/>
-          <w:sz w:val="28"/>
-        </w:rPr>
-        <w:t>address)</w:t>
-      </w:r>
-      <w:r>
-        <w:rPr>
-          <w:rFonts w:ascii="Segoe UI Symbol" w:eastAsia="Segoe UI Symbol" w:hAnsi="Segoe UI Symbol" w:cs="Segoe UI Symbol"/>
-          <w:sz w:val="28"/>
-        </w:rPr>
-        <w:t xml:space="preserve">   </w:t>
-      </w:r>
-      <w:proofErr w:type="gramEnd"/>
-      <w:r>
-        <w:rPr>
-          <w:rFonts w:ascii="Segoe UI Symbol" w:eastAsia="Segoe UI Symbol" w:hAnsi="Segoe UI Symbol" w:cs="Segoe UI Symbol"/>
-          <w:sz w:val="28"/>
-        </w:rPr>
-        <w:t xml:space="preserve"> {{</w:t>
+        <w:t xml:space="preserve"> (Present address)</w:t>
+      </w:r>
+      <w:r>
+        <w:rPr>
+          <w:rFonts w:ascii="Segoe UI Symbol" w:eastAsia="Segoe UI Symbol" w:hAnsi="Segoe UI Symbol" w:cs="Segoe UI Symbol"/>
+          <w:sz w:val="28"/>
+        </w:rPr>
+        <w:t xml:space="preserve">    {{</w:t>
       </w:r>
       <w:proofErr w:type="spellStart"/>
       <w:r>
@@ -8043,30 +7844,14 @@
           <w:rFonts w:ascii="AngsanaUPC" w:eastAsia="Segoe UI Symbol" w:hAnsi="AngsanaUPC" w:cs="AngsanaUPC"/>
           <w:sz w:val="28"/>
         </w:rPr>
-        <w:t xml:space="preserve"> (</w:t>
-      </w:r>
-      <w:proofErr w:type="gramStart"/>
-      <w:r>
-        <w:rPr>
-          <w:rFonts w:ascii="AngsanaUPC" w:eastAsia="Segoe UI Symbol" w:hAnsi="AngsanaUPC" w:cs="AngsanaUPC"/>
-          <w:sz w:val="28"/>
-        </w:rPr>
-        <w:t>Food)</w:t>
-      </w:r>
-      <w:r>
-        <w:rPr>
-          <w:rFonts w:ascii="Segoe UI Symbol" w:eastAsia="Segoe UI Symbol" w:hAnsi="Segoe UI Symbol" w:cs="Segoe UI Symbol"/>
-          <w:sz w:val="28"/>
-        </w:rPr>
-        <w:t xml:space="preserve">   </w:t>
-      </w:r>
-      <w:proofErr w:type="gramEnd"/>
-      <w:r>
-        <w:rPr>
-          <w:rFonts w:ascii="Segoe UI Symbol" w:eastAsia="Segoe UI Symbol" w:hAnsi="Segoe UI Symbol" w:cs="Segoe UI Symbol"/>
-          <w:sz w:val="28"/>
-        </w:rPr>
-        <w:t xml:space="preserve">     {{</w:t>
+        <w:t xml:space="preserve"> (Food)</w:t>
+      </w:r>
+      <w:r>
+        <w:rPr>
+          <w:rFonts w:ascii="Segoe UI Symbol" w:eastAsia="Segoe UI Symbol" w:hAnsi="Segoe UI Symbol" w:cs="Segoe UI Symbol"/>
+          <w:sz w:val="28"/>
+        </w:rPr>
+        <w:t xml:space="preserve">        {{</w:t>
       </w:r>
       <w:proofErr w:type="spellStart"/>
       <w:r>
@@ -8147,23 +7932,7 @@
           <w:rFonts w:ascii="Segoe UI Symbol" w:eastAsia="Segoe UI Symbol" w:hAnsi="Segoe UI Symbol" w:cs="Segoe UI Symbol"/>
           <w:sz w:val="28"/>
         </w:rPr>
-        <w:t xml:space="preserve"> </w:t>
-      </w:r>
-      <w:proofErr w:type="gramStart"/>
-      <w:r>
-        <w:rPr>
-          <w:rFonts w:ascii="Segoe UI Symbol" w:eastAsia="Segoe UI Symbol" w:hAnsi="Segoe UI Symbol" w:cs="Segoe UI Symbol"/>
-          <w:sz w:val="28"/>
-        </w:rPr>
-        <w:t xml:space="preserve">   {</w:t>
-      </w:r>
-      <w:proofErr w:type="gramEnd"/>
-      <w:r>
-        <w:rPr>
-          <w:rFonts w:ascii="Segoe UI Symbol" w:eastAsia="Segoe UI Symbol" w:hAnsi="Segoe UI Symbol" w:cs="Segoe UI Symbol"/>
-          <w:sz w:val="28"/>
-        </w:rPr>
-        <w:t>{</w:t>
+        <w:t xml:space="preserve">    {{</w:t>
       </w:r>
       <w:proofErr w:type="spellStart"/>
       <w:r>
@@ -8349,30 +8118,14 @@
           <w:rFonts w:ascii="AngsanaUPC" w:eastAsia="Segoe UI Symbol" w:hAnsi="AngsanaUPC" w:cs="AngsanaUPC"/>
           <w:sz w:val="28"/>
         </w:rPr>
-        <w:t xml:space="preserve"> (</w:t>
-      </w:r>
-      <w:proofErr w:type="gramStart"/>
-      <w:r>
-        <w:rPr>
-          <w:rFonts w:ascii="AngsanaUPC" w:eastAsia="Segoe UI Symbol" w:hAnsi="AngsanaUPC" w:cs="AngsanaUPC"/>
-          <w:sz w:val="28"/>
-        </w:rPr>
-        <w:t>Sadness)</w:t>
-      </w:r>
-      <w:r>
-        <w:rPr>
-          <w:rFonts w:ascii="Segoe UI Symbol" w:eastAsia="Segoe UI Symbol" w:hAnsi="Segoe UI Symbol" w:cs="Segoe UI Symbol"/>
-          <w:sz w:val="28"/>
-        </w:rPr>
-        <w:t xml:space="preserve">   </w:t>
-      </w:r>
-      <w:proofErr w:type="gramEnd"/>
-      <w:r>
-        <w:rPr>
-          <w:rFonts w:ascii="Segoe UI Symbol" w:eastAsia="Segoe UI Symbol" w:hAnsi="Segoe UI Symbol" w:cs="Segoe UI Symbol"/>
-          <w:sz w:val="28"/>
-        </w:rPr>
-        <w:t xml:space="preserve">     {{</w:t>
+        <w:t xml:space="preserve"> (Sadness)</w:t>
+      </w:r>
+      <w:r>
+        <w:rPr>
+          <w:rFonts w:ascii="Segoe UI Symbol" w:eastAsia="Segoe UI Symbol" w:hAnsi="Segoe UI Symbol" w:cs="Segoe UI Symbol"/>
+          <w:sz w:val="28"/>
+        </w:rPr>
+        <w:t xml:space="preserve">        {{</w:t>
       </w:r>
       <w:proofErr w:type="spellStart"/>
       <w:r>
@@ -9570,21 +9323,12 @@
         <w:t>doctorName</w:t>
       </w:r>
       <w:proofErr w:type="spellEnd"/>
-      <w:proofErr w:type="gramStart"/>
-      <w:r>
-        <w:rPr>
-          <w:rFonts w:ascii="AngsanaUPC" w:hAnsi="AngsanaUPC" w:cs="AngsanaUPC"/>
-          <w:sz w:val="28"/>
-        </w:rPr>
-        <w:t xml:space="preserve">}}   </w:t>
-      </w:r>
-      <w:proofErr w:type="gramEnd"/>
-      <w:r>
-        <w:rPr>
-          <w:rFonts w:ascii="AngsanaUPC" w:hAnsi="AngsanaUPC" w:cs="AngsanaUPC"/>
-          <w:sz w:val="28"/>
-        </w:rPr>
-        <w:t xml:space="preserve"> </w:t>
+      <w:r>
+        <w:rPr>
+          <w:rFonts w:ascii="AngsanaUPC" w:hAnsi="AngsanaUPC" w:cs="AngsanaUPC"/>
+          <w:sz w:val="28"/>
+        </w:rPr>
+        <w:t xml:space="preserve">}}    </w:t>
       </w:r>
       <w:proofErr w:type="spellStart"/>
       <w:r>
@@ -9764,25 +9508,7 @@
                                 <w:sz w:val="24"/>
                                 <w:szCs w:val="24"/>
                               </w:rPr>
-                              <w:t>{{</w:t>
-                            </w:r>
-                            <w:proofErr w:type="spellStart"/>
-                            <w:r>
-                              <w:rPr>
-                                <w:rFonts w:ascii="AngsanaUPC" w:hAnsi="AngsanaUPC" w:cs="AngsanaUPC"/>
-                                <w:sz w:val="24"/>
-                                <w:szCs w:val="24"/>
-                              </w:rPr>
-                              <w:t>visitDate</w:t>
-                            </w:r>
-                            <w:proofErr w:type="spellEnd"/>
-                            <w:r>
-                              <w:rPr>
-                                <w:rFonts w:ascii="AngsanaUPC" w:hAnsi="AngsanaUPC" w:cs="AngsanaUPC"/>
-                                <w:sz w:val="24"/>
-                                <w:szCs w:val="24"/>
-                              </w:rPr>
-                              <w:t>}}</w:t>
+                              <w:t>{{visitDate}}</w:t>
                             </w:r>
                           </w:p>
                         </w:txbxContent>
@@ -10001,23 +9727,13 @@
         <w:t>patientName</w:t>
       </w:r>
       <w:proofErr w:type="spellEnd"/>
-      <w:proofErr w:type="gramStart"/>
       <w:r>
         <w:rPr>
           <w:rFonts w:ascii="AngsanaUPC" w:hAnsi="AngsanaUPC" w:cs="AngsanaUPC"/>
           <w:sz w:val="24"/>
           <w:szCs w:val="24"/>
         </w:rPr>
-        <w:t xml:space="preserve">}}   </w:t>
-      </w:r>
-      <w:proofErr w:type="gramEnd"/>
-      <w:r>
-        <w:rPr>
-          <w:rFonts w:ascii="AngsanaUPC" w:hAnsi="AngsanaUPC" w:cs="AngsanaUPC"/>
-          <w:sz w:val="24"/>
-          <w:szCs w:val="24"/>
-        </w:rPr>
-        <w:t xml:space="preserve">     </w:t>
+        <w:t xml:space="preserve">}}        </w:t>
       </w:r>
       <w:proofErr w:type="spellStart"/>
       <w:r>
@@ -10172,25 +9888,7 @@
           <w:sz w:val="24"/>
           <w:szCs w:val="24"/>
         </w:rPr>
-        <w:t xml:space="preserve"> </w:t>
-      </w:r>
-      <w:proofErr w:type="gramStart"/>
-      <w:r>
-        <w:rPr>
-          <w:rFonts w:ascii="Segoe UI Symbol" w:eastAsia="Segoe UI Symbol" w:hAnsi="Segoe UI Symbol" w:cs="Segoe UI Symbol"/>
-          <w:sz w:val="24"/>
-          <w:szCs w:val="24"/>
-        </w:rPr>
-        <w:t xml:space="preserve">   {</w:t>
-      </w:r>
-      <w:proofErr w:type="gramEnd"/>
-      <w:r>
-        <w:rPr>
-          <w:rFonts w:ascii="Segoe UI Symbol" w:eastAsia="Segoe UI Symbol" w:hAnsi="Segoe UI Symbol" w:cs="Segoe UI Symbol"/>
-          <w:sz w:val="24"/>
-          <w:szCs w:val="24"/>
-        </w:rPr>
-        <w:t>{</w:t>
+        <w:t xml:space="preserve">    {{</w:t>
       </w:r>
       <w:proofErr w:type="spellStart"/>
       <w:r>
@@ -10286,25 +9984,7 @@
           <w:sz w:val="24"/>
           <w:szCs w:val="24"/>
         </w:rPr>
-        <w:t xml:space="preserve"> </w:t>
-      </w:r>
-      <w:proofErr w:type="gramStart"/>
-      <w:r>
-        <w:rPr>
-          <w:rFonts w:ascii="Segoe UI Symbol" w:eastAsia="Segoe UI Symbol" w:hAnsi="Segoe UI Symbol" w:cs="Segoe UI Symbol"/>
-          <w:sz w:val="24"/>
-          <w:szCs w:val="24"/>
-        </w:rPr>
-        <w:t xml:space="preserve">   {</w:t>
-      </w:r>
-      <w:proofErr w:type="gramEnd"/>
-      <w:r>
-        <w:rPr>
-          <w:rFonts w:ascii="Segoe UI Symbol" w:eastAsia="Segoe UI Symbol" w:hAnsi="Segoe UI Symbol" w:cs="Segoe UI Symbol"/>
-          <w:sz w:val="24"/>
-          <w:szCs w:val="24"/>
-        </w:rPr>
-        <w:t>{</w:t>
+        <w:t xml:space="preserve">    {{</w:t>
       </w:r>
       <w:proofErr w:type="spellStart"/>
       <w:r>
@@ -11101,23 +10781,13 @@
                               </w:rPr>
                               <w:t>{{</w:t>
                             </w:r>
-                            <w:proofErr w:type="spellStart"/>
                             <w:r>
                               <w:rPr>
                                 <w:rFonts w:ascii="AngsanaUPC" w:hAnsi="AngsanaUPC" w:cs="AngsanaUPC"/>
                                 <w:sz w:val="24"/>
                                 <w:szCs w:val="24"/>
                               </w:rPr>
-                              <w:t>doctorName</w:t>
-                            </w:r>
-                            <w:proofErr w:type="spellEnd"/>
-                            <w:r>
-                              <w:rPr>
-                                <w:rFonts w:ascii="AngsanaUPC" w:hAnsi="AngsanaUPC" w:cs="AngsanaUPC"/>
-                                <w:sz w:val="24"/>
-                                <w:szCs w:val="24"/>
-                              </w:rPr>
-                              <w:t>}}</w:t>
+                              <w:t>doctorName}}</w:t>
                             </w:r>
                           </w:p>
                           <w:p/>
@@ -11243,23 +10913,13 @@
                               </w:rPr>
                               <w:t>{{</w:t>
                             </w:r>
-                            <w:proofErr w:type="spellStart"/>
                             <w:r>
                               <w:rPr>
                                 <w:rFonts w:ascii="AngsanaUPC" w:hAnsi="AngsanaUPC" w:cs="AngsanaUPC"/>
                                 <w:sz w:val="24"/>
                                 <w:szCs w:val="24"/>
                               </w:rPr>
-                              <w:t>doctorLicenseNo</w:t>
-                            </w:r>
-                            <w:proofErr w:type="spellEnd"/>
-                            <w:r>
-                              <w:rPr>
-                                <w:rFonts w:ascii="AngsanaUPC" w:hAnsi="AngsanaUPC" w:cs="AngsanaUPC"/>
-                                <w:sz w:val="24"/>
-                                <w:szCs w:val="24"/>
-                              </w:rPr>
-                              <w:t>}}</w:t>
+                              <w:t>doctorLicenseNo}}</w:t>
                             </w:r>
                           </w:p>
                         </w:txbxContent>
@@ -11323,7 +10983,7 @@
       <w:pPr>
         <w:jc w:val="right"/>
         <w:rPr>
-          <w:rFonts w:ascii="TH SarabunPSK" w:hAnsi="TH SarabunPSK" w:cs="TH SarabunPSK" w:hint="cs"/>
+          <w:rFonts w:ascii="TH SarabunPSK" w:hAnsi="TH SarabunPSK" w:cs="TH SarabunPSK"/>
           <w:b/>
           <w:bCs/>
           <w:sz w:val="24"/>

</xml_diff>

<commit_message>
feat: scaffold comprehensive project agent skills and configuration directory structure
</commit_message>
<xml_diff>
--- a/backend/src/main/resources/templates/client_intake_form.docx
+++ b/backend/src/main/resources/templates/client_intake_form.docx
@@ -95,6 +95,7 @@
           <w:tab w:val="left" w:pos="7655"/>
           <w:tab w:val="center" w:pos="8364"/>
         </w:tabs>
+        <w:spacing w:after="0"/>
         <w:jc w:val="center"/>
         <w:rPr>
           <w:rFonts w:ascii="AngsanaUPC" w:hAnsi="AngsanaUPC" w:cs="AngsanaUPC"/>
@@ -3986,6 +3987,7 @@
               <w:t>fam_deny</w:t>
             </w:r>
             <w:proofErr w:type="spellEnd"/>
+            <w:proofErr w:type="gramStart"/>
             <w:r>
               <w:rPr>
                 <w:rFonts w:ascii="Segoe UI Symbol" w:eastAsia="Segoe UI Symbol" w:hAnsi="Segoe UI Symbol" w:cs="Segoe UI Symbol"/>
@@ -4005,6 +4007,7 @@
               </w:rPr>
               <w:t>ครอบครัวปฏิเสธโรคทางพันธุกรรม</w:t>
             </w:r>
+            <w:proofErr w:type="gramEnd"/>
           </w:p>
         </w:tc>
         <w:tc>
@@ -4041,6 +4044,7 @@
               <w:t>fam_have</w:t>
             </w:r>
             <w:proofErr w:type="spellEnd"/>
+            <w:proofErr w:type="gramStart"/>
             <w:r>
               <w:rPr>
                 <w:rFonts w:ascii="Segoe UI Symbol" w:eastAsia="Segoe UI Symbol" w:hAnsi="Segoe UI Symbol" w:cs="Segoe UI Symbol"/>
@@ -4060,6 +4064,7 @@
               </w:rPr>
               <w:t>ครอบครัวมีโรคทางพันธุกรรม</w:t>
             </w:r>
+            <w:proofErr w:type="gramEnd"/>
           </w:p>
         </w:tc>
       </w:tr>
@@ -4587,6 +4592,7 @@
         <w:t xml:space="preserve"> / </w:t>
       </w:r>
       <w:proofErr w:type="spellStart"/>
+      <w:proofErr w:type="gramStart"/>
       <w:r>
         <w:rPr>
           <w:rFonts w:ascii="AngsanaUPC" w:hAnsi="AngsanaUPC" w:cs="AngsanaUPC"/>
@@ -4604,7 +4610,17 @@
           <w:bCs/>
           <w:sz w:val="28"/>
         </w:rPr>
-        <w:t>(Beats/min)</w:t>
+        <w:t>(</w:t>
+      </w:r>
+      <w:proofErr w:type="gramEnd"/>
+      <w:r>
+        <w:rPr>
+          <w:rFonts w:ascii="AngsanaUPC" w:hAnsi="AngsanaUPC" w:cs="AngsanaUPC"/>
+          <w:b/>
+          <w:bCs/>
+          <w:sz w:val="28"/>
+        </w:rPr>
+        <w:t>Beats/min)</w:t>
       </w:r>
     </w:p>
     <w:p>
@@ -4757,6 +4773,7 @@
         <w:t xml:space="preserve"> </w:t>
       </w:r>
       <w:proofErr w:type="spellStart"/>
+      <w:proofErr w:type="gramStart"/>
       <w:r>
         <w:rPr>
           <w:rFonts w:ascii="AngsanaUPC" w:hAnsi="AngsanaUPC" w:cs="AngsanaUPC"/>
@@ -4767,6 +4784,7 @@
         <w:t>มม.ปรอท</w:t>
       </w:r>
       <w:proofErr w:type="spellEnd"/>
+      <w:proofErr w:type="gramEnd"/>
       <w:r>
         <w:rPr>
           <w:rFonts w:ascii="AngsanaUPC" w:hAnsi="AngsanaUPC" w:cs="AngsanaUPC"/>
@@ -5320,7 +5338,16 @@
           <w:sz w:val="32"/>
           <w:szCs w:val="32"/>
         </w:rPr>
-        <w:t xml:space="preserve">Bicep Jerk     </w:t>
+        <w:t xml:space="preserve">Bicep Jerk   </w:t>
+      </w:r>
+      <w:proofErr w:type="gramStart"/>
+      <w:r>
+        <w:rPr>
+          <w:rFonts w:ascii="AngsanaUPC" w:hAnsi="AngsanaUPC" w:cs="AngsanaUPC"/>
+          <w:sz w:val="32"/>
+          <w:szCs w:val="32"/>
+        </w:rPr>
+        <w:t xml:space="preserve">  </w:t>
       </w:r>
       <w:r>
         <w:rPr>
@@ -5337,7 +5364,16 @@
           <w:sz w:val="32"/>
           <w:szCs w:val="32"/>
         </w:rPr>
-        <w:t>{{</w:t>
+        <w:t>{</w:t>
+      </w:r>
+      <w:proofErr w:type="gramEnd"/>
+      <w:r>
+        <w:rPr>
+          <w:rFonts w:ascii="AngsanaUPC" w:hAnsi="AngsanaUPC" w:cs="AngsanaUPC"/>
+          <w:sz w:val="32"/>
+          <w:szCs w:val="32"/>
+        </w:rPr>
+        <w:t>{</w:t>
       </w:r>
       <w:proofErr w:type="spellStart"/>
       <w:r>
@@ -5484,15 +5520,34 @@
           <w:szCs w:val="32"/>
           <w:cs/>
         </w:rPr>
-        <w:t xml:space="preserve">    </w:t>
-      </w:r>
-      <w:r>
-        <w:rPr>
-          <w:rFonts w:ascii="AngsanaUPC" w:hAnsi="AngsanaUPC" w:cs="AngsanaUPC"/>
+        <w:t xml:space="preserve"> </w:t>
+      </w:r>
+      <w:proofErr w:type="gramStart"/>
+      <w:r>
+        <w:rPr>
+          <w:rFonts w:ascii="AngsanaUPC" w:hAnsi="AngsanaUPC" w:cs="AngsanaUPC" w:hint="cs"/>
           <w:sz w:val="32"/>
           <w:szCs w:val="32"/>
-        </w:rPr>
-        <w:t>{{</w:t>
+          <w:cs/>
+        </w:rPr>
+        <w:t xml:space="preserve">   </w:t>
+      </w:r>
+      <w:r>
+        <w:rPr>
+          <w:rFonts w:ascii="AngsanaUPC" w:hAnsi="AngsanaUPC" w:cs="AngsanaUPC"/>
+          <w:sz w:val="32"/>
+          <w:szCs w:val="32"/>
+        </w:rPr>
+        <w:t>{</w:t>
+      </w:r>
+      <w:proofErr w:type="gramEnd"/>
+      <w:r>
+        <w:rPr>
+          <w:rFonts w:ascii="AngsanaUPC" w:hAnsi="AngsanaUPC" w:cs="AngsanaUPC"/>
+          <w:sz w:val="32"/>
+          <w:szCs w:val="32"/>
+        </w:rPr>
+        <w:t>{</w:t>
       </w:r>
       <w:proofErr w:type="spellStart"/>
       <w:r>
@@ -5629,6 +5684,7 @@
         </w:rPr>
         <w:t xml:space="preserve">Knee Jerk     </w:t>
       </w:r>
+      <w:proofErr w:type="gramStart"/>
       <w:r>
         <w:rPr>
           <w:rFonts w:ascii="AngsanaUPC" w:hAnsi="AngsanaUPC" w:cs="AngsanaUPC" w:hint="cs"/>
@@ -5644,7 +5700,16 @@
           <w:sz w:val="32"/>
           <w:szCs w:val="32"/>
         </w:rPr>
-        <w:t>{{</w:t>
+        <w:t>{</w:t>
+      </w:r>
+      <w:proofErr w:type="gramEnd"/>
+      <w:r>
+        <w:rPr>
+          <w:rFonts w:ascii="AngsanaUPC" w:hAnsi="AngsanaUPC" w:cs="AngsanaUPC"/>
+          <w:sz w:val="32"/>
+          <w:szCs w:val="32"/>
+        </w:rPr>
+        <w:t>{</w:t>
       </w:r>
       <w:proofErr w:type="spellStart"/>
       <w:r>
@@ -5765,6 +5830,7 @@
         </w:rPr>
         <w:t xml:space="preserve">Ankle Jerk    </w:t>
       </w:r>
+      <w:proofErr w:type="gramStart"/>
       <w:r>
         <w:rPr>
           <w:rFonts w:ascii="AngsanaUPC" w:hAnsi="AngsanaUPC" w:cs="AngsanaUPC" w:hint="cs"/>
@@ -5780,7 +5846,16 @@
           <w:sz w:val="32"/>
           <w:szCs w:val="32"/>
         </w:rPr>
-        <w:t>{{</w:t>
+        <w:t>{</w:t>
+      </w:r>
+      <w:proofErr w:type="gramEnd"/>
+      <w:r>
+        <w:rPr>
+          <w:rFonts w:ascii="AngsanaUPC" w:hAnsi="AngsanaUPC" w:cs="AngsanaUPC"/>
+          <w:sz w:val="32"/>
+          <w:szCs w:val="32"/>
+        </w:rPr>
+        <w:t>{</w:t>
       </w:r>
       <w:proofErr w:type="spellStart"/>
       <w:r>
@@ -6071,7 +6146,23 @@
           <w:rFonts w:ascii="Segoe UI Symbol" w:eastAsia="Segoe UI Symbol" w:hAnsi="Segoe UI Symbol" w:cs="Segoe UI Symbol"/>
           <w:sz w:val="28"/>
         </w:rPr>
-        <w:t xml:space="preserve">    {{</w:t>
+        <w:t xml:space="preserve"> </w:t>
+      </w:r>
+      <w:proofErr w:type="gramStart"/>
+      <w:r>
+        <w:rPr>
+          <w:rFonts w:ascii="Segoe UI Symbol" w:eastAsia="Segoe UI Symbol" w:hAnsi="Segoe UI Symbol" w:cs="Segoe UI Symbol"/>
+          <w:sz w:val="28"/>
+        </w:rPr>
+        <w:t xml:space="preserve">   {</w:t>
+      </w:r>
+      <w:proofErr w:type="gramEnd"/>
+      <w:r>
+        <w:rPr>
+          <w:rFonts w:ascii="Segoe UI Symbol" w:eastAsia="Segoe UI Symbol" w:hAnsi="Segoe UI Symbol" w:cs="Segoe UI Symbol"/>
+          <w:sz w:val="28"/>
+        </w:rPr>
+        <w:t>{</w:t>
       </w:r>
       <w:proofErr w:type="spellStart"/>
       <w:r>
@@ -6273,7 +6364,23 @@
           <w:rFonts w:ascii="Segoe UI Symbol" w:eastAsia="Segoe UI Symbol" w:hAnsi="Segoe UI Symbol" w:cs="Segoe UI Symbol"/>
           <w:sz w:val="28"/>
         </w:rPr>
-        <w:t xml:space="preserve">    {{</w:t>
+        <w:t xml:space="preserve"> </w:t>
+      </w:r>
+      <w:proofErr w:type="gramStart"/>
+      <w:r>
+        <w:rPr>
+          <w:rFonts w:ascii="Segoe UI Symbol" w:eastAsia="Segoe UI Symbol" w:hAnsi="Segoe UI Symbol" w:cs="Segoe UI Symbol"/>
+          <w:sz w:val="28"/>
+        </w:rPr>
+        <w:t xml:space="preserve">   {</w:t>
+      </w:r>
+      <w:proofErr w:type="gramEnd"/>
+      <w:r>
+        <w:rPr>
+          <w:rFonts w:ascii="Segoe UI Symbol" w:eastAsia="Segoe UI Symbol" w:hAnsi="Segoe UI Symbol" w:cs="Segoe UI Symbol"/>
+          <w:sz w:val="28"/>
+        </w:rPr>
+        <w:t>{</w:t>
       </w:r>
       <w:proofErr w:type="spellStart"/>
       <w:r>
@@ -6465,7 +6572,23 @@
           <w:rFonts w:ascii="Segoe UI Symbol" w:eastAsia="Segoe UI Symbol" w:hAnsi="Segoe UI Symbol" w:cs="Segoe UI Symbol"/>
           <w:sz w:val="28"/>
         </w:rPr>
-        <w:t xml:space="preserve">    {{</w:t>
+        <w:t xml:space="preserve"> </w:t>
+      </w:r>
+      <w:proofErr w:type="gramStart"/>
+      <w:r>
+        <w:rPr>
+          <w:rFonts w:ascii="Segoe UI Symbol" w:eastAsia="Segoe UI Symbol" w:hAnsi="Segoe UI Symbol" w:cs="Segoe UI Symbol"/>
+          <w:sz w:val="28"/>
+        </w:rPr>
+        <w:t xml:space="preserve">   {</w:t>
+      </w:r>
+      <w:proofErr w:type="gramEnd"/>
+      <w:r>
+        <w:rPr>
+          <w:rFonts w:ascii="Segoe UI Symbol" w:eastAsia="Segoe UI Symbol" w:hAnsi="Segoe UI Symbol" w:cs="Segoe UI Symbol"/>
+          <w:sz w:val="28"/>
+        </w:rPr>
+        <w:t>{</w:t>
       </w:r>
       <w:proofErr w:type="spellStart"/>
       <w:r>
@@ -6619,7 +6742,23 @@
           <w:rFonts w:ascii="Segoe UI Symbol" w:eastAsia="Segoe UI Symbol" w:hAnsi="Segoe UI Symbol" w:cs="Segoe UI Symbol"/>
           <w:sz w:val="28"/>
         </w:rPr>
-        <w:t xml:space="preserve">    {{</w:t>
+        <w:t xml:space="preserve"> </w:t>
+      </w:r>
+      <w:proofErr w:type="gramStart"/>
+      <w:r>
+        <w:rPr>
+          <w:rFonts w:ascii="Segoe UI Symbol" w:eastAsia="Segoe UI Symbol" w:hAnsi="Segoe UI Symbol" w:cs="Segoe UI Symbol"/>
+          <w:sz w:val="28"/>
+        </w:rPr>
+        <w:t xml:space="preserve">   {</w:t>
+      </w:r>
+      <w:proofErr w:type="gramEnd"/>
+      <w:r>
+        <w:rPr>
+          <w:rFonts w:ascii="Segoe UI Symbol" w:eastAsia="Segoe UI Symbol" w:hAnsi="Segoe UI Symbol" w:cs="Segoe UI Symbol"/>
+          <w:sz w:val="28"/>
+        </w:rPr>
+        <w:t>{</w:t>
       </w:r>
       <w:proofErr w:type="spellStart"/>
       <w:r>
@@ -6796,14 +6935,32 @@
           <w:bCs/>
           <w:sz w:val="28"/>
         </w:rPr>
-        <w:t xml:space="preserve"> (Age principles)</w:t>
-      </w:r>
-      <w:r>
-        <w:rPr>
-          <w:rFonts w:ascii="Segoe UI Symbol" w:eastAsia="Segoe UI Symbol" w:hAnsi="Segoe UI Symbol" w:cs="Segoe UI Symbol"/>
-          <w:sz w:val="28"/>
-        </w:rPr>
-        <w:t xml:space="preserve">    {{</w:t>
+        <w:t xml:space="preserve"> (Age </w:t>
+      </w:r>
+      <w:proofErr w:type="gramStart"/>
+      <w:r>
+        <w:rPr>
+          <w:rFonts w:ascii="AngsanaUPC" w:eastAsia="Segoe UI Symbol" w:hAnsi="AngsanaUPC" w:cs="AngsanaUPC"/>
+          <w:b/>
+          <w:bCs/>
+          <w:sz w:val="28"/>
+        </w:rPr>
+        <w:t>principles)</w:t>
+      </w:r>
+      <w:r>
+        <w:rPr>
+          <w:rFonts w:ascii="Segoe UI Symbol" w:eastAsia="Segoe UI Symbol" w:hAnsi="Segoe UI Symbol" w:cs="Segoe UI Symbol"/>
+          <w:sz w:val="28"/>
+        </w:rPr>
+        <w:t xml:space="preserve">   </w:t>
+      </w:r>
+      <w:proofErr w:type="gramEnd"/>
+      <w:r>
+        <w:rPr>
+          <w:rFonts w:ascii="Segoe UI Symbol" w:eastAsia="Segoe UI Symbol" w:hAnsi="Segoe UI Symbol" w:cs="Segoe UI Symbol"/>
+          <w:sz w:val="28"/>
+        </w:rPr>
+        <w:t xml:space="preserve"> {{</w:t>
       </w:r>
       <w:proofErr w:type="spellStart"/>
       <w:r>
@@ -6998,7 +7155,23 @@
           <w:rFonts w:ascii="Segoe UI Symbol" w:eastAsia="Segoe UI Symbol" w:hAnsi="Segoe UI Symbol" w:cs="Segoe UI Symbol"/>
           <w:sz w:val="28"/>
         </w:rPr>
-        <w:t xml:space="preserve">    {{</w:t>
+        <w:t xml:space="preserve"> </w:t>
+      </w:r>
+      <w:proofErr w:type="gramStart"/>
+      <w:r>
+        <w:rPr>
+          <w:rFonts w:ascii="Segoe UI Symbol" w:eastAsia="Segoe UI Symbol" w:hAnsi="Segoe UI Symbol" w:cs="Segoe UI Symbol"/>
+          <w:sz w:val="28"/>
+        </w:rPr>
+        <w:t xml:space="preserve">   {</w:t>
+      </w:r>
+      <w:proofErr w:type="gramEnd"/>
+      <w:r>
+        <w:rPr>
+          <w:rFonts w:ascii="Segoe UI Symbol" w:eastAsia="Segoe UI Symbol" w:hAnsi="Segoe UI Symbol" w:cs="Segoe UI Symbol"/>
+          <w:sz w:val="28"/>
+        </w:rPr>
+        <w:t>{</w:t>
       </w:r>
       <w:proofErr w:type="spellStart"/>
       <w:r>
@@ -7136,7 +7309,23 @@
           <w:rFonts w:ascii="Segoe UI Symbol" w:eastAsia="Segoe UI Symbol" w:hAnsi="Segoe UI Symbol" w:cs="Segoe UI Symbol"/>
           <w:sz w:val="28"/>
         </w:rPr>
-        <w:t xml:space="preserve">    {{</w:t>
+        <w:t xml:space="preserve"> </w:t>
+      </w:r>
+      <w:proofErr w:type="gramStart"/>
+      <w:r>
+        <w:rPr>
+          <w:rFonts w:ascii="Segoe UI Symbol" w:eastAsia="Segoe UI Symbol" w:hAnsi="Segoe UI Symbol" w:cs="Segoe UI Symbol"/>
+          <w:sz w:val="28"/>
+        </w:rPr>
+        <w:t xml:space="preserve">   {</w:t>
+      </w:r>
+      <w:proofErr w:type="gramEnd"/>
+      <w:r>
+        <w:rPr>
+          <w:rFonts w:ascii="Segoe UI Symbol" w:eastAsia="Segoe UI Symbol" w:hAnsi="Segoe UI Symbol" w:cs="Segoe UI Symbol"/>
+          <w:sz w:val="28"/>
+        </w:rPr>
+        <w:t>{</w:t>
       </w:r>
       <w:proofErr w:type="spellStart"/>
       <w:r>
@@ -7349,14 +7538,30 @@
           <w:rFonts w:ascii="AngsanaUPC" w:eastAsia="Segoe UI Symbol" w:hAnsi="AngsanaUPC" w:cs="AngsanaUPC"/>
           <w:sz w:val="28"/>
         </w:rPr>
-        <w:t xml:space="preserve"> (Place of birth)</w:t>
-      </w:r>
-      <w:r>
-        <w:rPr>
-          <w:rFonts w:ascii="Segoe UI Symbol" w:eastAsia="Segoe UI Symbol" w:hAnsi="Segoe UI Symbol" w:cs="Segoe UI Symbol"/>
-          <w:sz w:val="28"/>
-        </w:rPr>
-        <w:t xml:space="preserve">    {{</w:t>
+        <w:t xml:space="preserve"> (Place of </w:t>
+      </w:r>
+      <w:proofErr w:type="gramStart"/>
+      <w:r>
+        <w:rPr>
+          <w:rFonts w:ascii="AngsanaUPC" w:eastAsia="Segoe UI Symbol" w:hAnsi="AngsanaUPC" w:cs="AngsanaUPC"/>
+          <w:sz w:val="28"/>
+        </w:rPr>
+        <w:t>birth)</w:t>
+      </w:r>
+      <w:r>
+        <w:rPr>
+          <w:rFonts w:ascii="Segoe UI Symbol" w:eastAsia="Segoe UI Symbol" w:hAnsi="Segoe UI Symbol" w:cs="Segoe UI Symbol"/>
+          <w:sz w:val="28"/>
+        </w:rPr>
+        <w:t xml:space="preserve">   </w:t>
+      </w:r>
+      <w:proofErr w:type="gramEnd"/>
+      <w:r>
+        <w:rPr>
+          <w:rFonts w:ascii="Segoe UI Symbol" w:eastAsia="Segoe UI Symbol" w:hAnsi="Segoe UI Symbol" w:cs="Segoe UI Symbol"/>
+          <w:sz w:val="28"/>
+        </w:rPr>
+        <w:t xml:space="preserve"> {{</w:t>
       </w:r>
       <w:proofErr w:type="spellStart"/>
       <w:r>
@@ -7558,14 +7763,30 @@
           <w:rFonts w:ascii="AngsanaUPC" w:eastAsia="Segoe UI Symbol" w:hAnsi="AngsanaUPC" w:cs="AngsanaUPC"/>
           <w:sz w:val="28"/>
         </w:rPr>
-        <w:t xml:space="preserve"> (Present address)</w:t>
-      </w:r>
-      <w:r>
-        <w:rPr>
-          <w:rFonts w:ascii="Segoe UI Symbol" w:eastAsia="Segoe UI Symbol" w:hAnsi="Segoe UI Symbol" w:cs="Segoe UI Symbol"/>
-          <w:sz w:val="28"/>
-        </w:rPr>
-        <w:t xml:space="preserve">    {{</w:t>
+        <w:t xml:space="preserve"> (Present </w:t>
+      </w:r>
+      <w:proofErr w:type="gramStart"/>
+      <w:r>
+        <w:rPr>
+          <w:rFonts w:ascii="AngsanaUPC" w:eastAsia="Segoe UI Symbol" w:hAnsi="AngsanaUPC" w:cs="AngsanaUPC"/>
+          <w:sz w:val="28"/>
+        </w:rPr>
+        <w:t>address)</w:t>
+      </w:r>
+      <w:r>
+        <w:rPr>
+          <w:rFonts w:ascii="Segoe UI Symbol" w:eastAsia="Segoe UI Symbol" w:hAnsi="Segoe UI Symbol" w:cs="Segoe UI Symbol"/>
+          <w:sz w:val="28"/>
+        </w:rPr>
+        <w:t xml:space="preserve">   </w:t>
+      </w:r>
+      <w:proofErr w:type="gramEnd"/>
+      <w:r>
+        <w:rPr>
+          <w:rFonts w:ascii="Segoe UI Symbol" w:eastAsia="Segoe UI Symbol" w:hAnsi="Segoe UI Symbol" w:cs="Segoe UI Symbol"/>
+          <w:sz w:val="28"/>
+        </w:rPr>
+        <w:t xml:space="preserve"> {{</w:t>
       </w:r>
       <w:proofErr w:type="spellStart"/>
       <w:r>
@@ -7844,14 +8065,30 @@
           <w:rFonts w:ascii="AngsanaUPC" w:eastAsia="Segoe UI Symbol" w:hAnsi="AngsanaUPC" w:cs="AngsanaUPC"/>
           <w:sz w:val="28"/>
         </w:rPr>
-        <w:t xml:space="preserve"> (Food)</w:t>
-      </w:r>
-      <w:r>
-        <w:rPr>
-          <w:rFonts w:ascii="Segoe UI Symbol" w:eastAsia="Segoe UI Symbol" w:hAnsi="Segoe UI Symbol" w:cs="Segoe UI Symbol"/>
-          <w:sz w:val="28"/>
-        </w:rPr>
-        <w:t xml:space="preserve">        {{</w:t>
+        <w:t xml:space="preserve"> (</w:t>
+      </w:r>
+      <w:proofErr w:type="gramStart"/>
+      <w:r>
+        <w:rPr>
+          <w:rFonts w:ascii="AngsanaUPC" w:eastAsia="Segoe UI Symbol" w:hAnsi="AngsanaUPC" w:cs="AngsanaUPC"/>
+          <w:sz w:val="28"/>
+        </w:rPr>
+        <w:t>Food)</w:t>
+      </w:r>
+      <w:r>
+        <w:rPr>
+          <w:rFonts w:ascii="Segoe UI Symbol" w:eastAsia="Segoe UI Symbol" w:hAnsi="Segoe UI Symbol" w:cs="Segoe UI Symbol"/>
+          <w:sz w:val="28"/>
+        </w:rPr>
+        <w:t xml:space="preserve">   </w:t>
+      </w:r>
+      <w:proofErr w:type="gramEnd"/>
+      <w:r>
+        <w:rPr>
+          <w:rFonts w:ascii="Segoe UI Symbol" w:eastAsia="Segoe UI Symbol" w:hAnsi="Segoe UI Symbol" w:cs="Segoe UI Symbol"/>
+          <w:sz w:val="28"/>
+        </w:rPr>
+        <w:t xml:space="preserve">     {{</w:t>
       </w:r>
       <w:proofErr w:type="spellStart"/>
       <w:r>
@@ -7932,7 +8169,23 @@
           <w:rFonts w:ascii="Segoe UI Symbol" w:eastAsia="Segoe UI Symbol" w:hAnsi="Segoe UI Symbol" w:cs="Segoe UI Symbol"/>
           <w:sz w:val="28"/>
         </w:rPr>
-        <w:t xml:space="preserve">    {{</w:t>
+        <w:t xml:space="preserve"> </w:t>
+      </w:r>
+      <w:proofErr w:type="gramStart"/>
+      <w:r>
+        <w:rPr>
+          <w:rFonts w:ascii="Segoe UI Symbol" w:eastAsia="Segoe UI Symbol" w:hAnsi="Segoe UI Symbol" w:cs="Segoe UI Symbol"/>
+          <w:sz w:val="28"/>
+        </w:rPr>
+        <w:t xml:space="preserve">   {</w:t>
+      </w:r>
+      <w:proofErr w:type="gramEnd"/>
+      <w:r>
+        <w:rPr>
+          <w:rFonts w:ascii="Segoe UI Symbol" w:eastAsia="Segoe UI Symbol" w:hAnsi="Segoe UI Symbol" w:cs="Segoe UI Symbol"/>
+          <w:sz w:val="28"/>
+        </w:rPr>
+        <w:t>{</w:t>
       </w:r>
       <w:proofErr w:type="spellStart"/>
       <w:r>
@@ -8118,14 +8371,30 @@
           <w:rFonts w:ascii="AngsanaUPC" w:eastAsia="Segoe UI Symbol" w:hAnsi="AngsanaUPC" w:cs="AngsanaUPC"/>
           <w:sz w:val="28"/>
         </w:rPr>
-        <w:t xml:space="preserve"> (Sadness)</w:t>
-      </w:r>
-      <w:r>
-        <w:rPr>
-          <w:rFonts w:ascii="Segoe UI Symbol" w:eastAsia="Segoe UI Symbol" w:hAnsi="Segoe UI Symbol" w:cs="Segoe UI Symbol"/>
-          <w:sz w:val="28"/>
-        </w:rPr>
-        <w:t xml:space="preserve">        {{</w:t>
+        <w:t xml:space="preserve"> (</w:t>
+      </w:r>
+      <w:proofErr w:type="gramStart"/>
+      <w:r>
+        <w:rPr>
+          <w:rFonts w:ascii="AngsanaUPC" w:eastAsia="Segoe UI Symbol" w:hAnsi="AngsanaUPC" w:cs="AngsanaUPC"/>
+          <w:sz w:val="28"/>
+        </w:rPr>
+        <w:t>Sadness)</w:t>
+      </w:r>
+      <w:r>
+        <w:rPr>
+          <w:rFonts w:ascii="Segoe UI Symbol" w:eastAsia="Segoe UI Symbol" w:hAnsi="Segoe UI Symbol" w:cs="Segoe UI Symbol"/>
+          <w:sz w:val="28"/>
+        </w:rPr>
+        <w:t xml:space="preserve">   </w:t>
+      </w:r>
+      <w:proofErr w:type="gramEnd"/>
+      <w:r>
+        <w:rPr>
+          <w:rFonts w:ascii="Segoe UI Symbol" w:eastAsia="Segoe UI Symbol" w:hAnsi="Segoe UI Symbol" w:cs="Segoe UI Symbol"/>
+          <w:sz w:val="28"/>
+        </w:rPr>
+        <w:t xml:space="preserve">     {{</w:t>
       </w:r>
       <w:proofErr w:type="spellStart"/>
       <w:r>
@@ -9323,12 +9592,21 @@
         <w:t>doctorName</w:t>
       </w:r>
       <w:proofErr w:type="spellEnd"/>
-      <w:r>
-        <w:rPr>
-          <w:rFonts w:ascii="AngsanaUPC" w:hAnsi="AngsanaUPC" w:cs="AngsanaUPC"/>
-          <w:sz w:val="28"/>
-        </w:rPr>
-        <w:t xml:space="preserve">}}    </w:t>
+      <w:proofErr w:type="gramStart"/>
+      <w:r>
+        <w:rPr>
+          <w:rFonts w:ascii="AngsanaUPC" w:hAnsi="AngsanaUPC" w:cs="AngsanaUPC"/>
+          <w:sz w:val="28"/>
+        </w:rPr>
+        <w:t xml:space="preserve">}}   </w:t>
+      </w:r>
+      <w:proofErr w:type="gramEnd"/>
+      <w:r>
+        <w:rPr>
+          <w:rFonts w:ascii="AngsanaUPC" w:hAnsi="AngsanaUPC" w:cs="AngsanaUPC"/>
+          <w:sz w:val="28"/>
+        </w:rPr>
+        <w:t xml:space="preserve"> </w:t>
       </w:r>
       <w:proofErr w:type="spellStart"/>
       <w:r>
@@ -9727,13 +10005,23 @@
         <w:t>patientName</w:t>
       </w:r>
       <w:proofErr w:type="spellEnd"/>
+      <w:proofErr w:type="gramStart"/>
       <w:r>
         <w:rPr>
           <w:rFonts w:ascii="AngsanaUPC" w:hAnsi="AngsanaUPC" w:cs="AngsanaUPC"/>
           <w:sz w:val="24"/>
           <w:szCs w:val="24"/>
         </w:rPr>
-        <w:t xml:space="preserve">}}        </w:t>
+        <w:t xml:space="preserve">}}   </w:t>
+      </w:r>
+      <w:proofErr w:type="gramEnd"/>
+      <w:r>
+        <w:rPr>
+          <w:rFonts w:ascii="AngsanaUPC" w:hAnsi="AngsanaUPC" w:cs="AngsanaUPC"/>
+          <w:sz w:val="24"/>
+          <w:szCs w:val="24"/>
+        </w:rPr>
+        <w:t xml:space="preserve">     </w:t>
       </w:r>
       <w:proofErr w:type="spellStart"/>
       <w:r>
@@ -9888,7 +10176,25 @@
           <w:sz w:val="24"/>
           <w:szCs w:val="24"/>
         </w:rPr>
-        <w:t xml:space="preserve">    {{</w:t>
+        <w:t xml:space="preserve"> </w:t>
+      </w:r>
+      <w:proofErr w:type="gramStart"/>
+      <w:r>
+        <w:rPr>
+          <w:rFonts w:ascii="Segoe UI Symbol" w:eastAsia="Segoe UI Symbol" w:hAnsi="Segoe UI Symbol" w:cs="Segoe UI Symbol"/>
+          <w:sz w:val="24"/>
+          <w:szCs w:val="24"/>
+        </w:rPr>
+        <w:t xml:space="preserve">   {</w:t>
+      </w:r>
+      <w:proofErr w:type="gramEnd"/>
+      <w:r>
+        <w:rPr>
+          <w:rFonts w:ascii="Segoe UI Symbol" w:eastAsia="Segoe UI Symbol" w:hAnsi="Segoe UI Symbol" w:cs="Segoe UI Symbol"/>
+          <w:sz w:val="24"/>
+          <w:szCs w:val="24"/>
+        </w:rPr>
+        <w:t>{</w:t>
       </w:r>
       <w:proofErr w:type="spellStart"/>
       <w:r>
@@ -9984,7 +10290,25 @@
           <w:sz w:val="24"/>
           <w:szCs w:val="24"/>
         </w:rPr>
-        <w:t xml:space="preserve">    {{</w:t>
+        <w:t xml:space="preserve"> </w:t>
+      </w:r>
+      <w:proofErr w:type="gramStart"/>
+      <w:r>
+        <w:rPr>
+          <w:rFonts w:ascii="Segoe UI Symbol" w:eastAsia="Segoe UI Symbol" w:hAnsi="Segoe UI Symbol" w:cs="Segoe UI Symbol"/>
+          <w:sz w:val="24"/>
+          <w:szCs w:val="24"/>
+        </w:rPr>
+        <w:t xml:space="preserve">   {</w:t>
+      </w:r>
+      <w:proofErr w:type="gramEnd"/>
+      <w:r>
+        <w:rPr>
+          <w:rFonts w:ascii="Segoe UI Symbol" w:eastAsia="Segoe UI Symbol" w:hAnsi="Segoe UI Symbol" w:cs="Segoe UI Symbol"/>
+          <w:sz w:val="24"/>
+          <w:szCs w:val="24"/>
+        </w:rPr>
+        <w:t>{</w:t>
       </w:r>
       <w:proofErr w:type="spellStart"/>
       <w:r>
@@ -10779,15 +11103,7 @@
                                 <w:sz w:val="24"/>
                                 <w:szCs w:val="24"/>
                               </w:rPr>
-                              <w:t>{{</w:t>
-                            </w:r>
-                            <w:r>
-                              <w:rPr>
-                                <w:rFonts w:ascii="AngsanaUPC" w:hAnsi="AngsanaUPC" w:cs="AngsanaUPC"/>
-                                <w:sz w:val="24"/>
-                                <w:szCs w:val="24"/>
-                              </w:rPr>
-                              <w:t>doctorName}}</w:t>
+                              <w:t>{{doctorName}}</w:t>
                             </w:r>
                           </w:p>
                           <w:p/>
@@ -10911,15 +11227,7 @@
                                 <w:sz w:val="24"/>
                                 <w:szCs w:val="24"/>
                               </w:rPr>
-                              <w:t>{{</w:t>
-                            </w:r>
-                            <w:r>
-                              <w:rPr>
-                                <w:rFonts w:ascii="AngsanaUPC" w:hAnsi="AngsanaUPC" w:cs="AngsanaUPC"/>
-                                <w:sz w:val="24"/>
-                                <w:szCs w:val="24"/>
-                              </w:rPr>
-                              <w:t>doctorLicenseNo}}</w:t>
+                              <w:t>{{doctorLicenseNo}}</w:t>
                             </w:r>
                           </w:p>
                         </w:txbxContent>

</xml_diff>